<commit_message>
Added Picotuner auto discovery
</commit_message>
<xml_diff>
--- a/docs/lynx_webui_manual.docx
+++ b/docs/lynx_webui_manual.docx
@@ -43,7 +43,7 @@
           <w:b/>
           <w:bCs/>
         </w:rPr>
-        <w:t xml:space="preserve">G8YTZ / EI3IOB — July 2026 — Version 1.2</w:t>
+        <w:t xml:space="preserve">G8YTZ / EI3IOB — July 2026 — Version 1.3</w:t>
       </w:r>
     </w:p>
     <w:p>
@@ -1241,6 +1241,14 @@
       </w:pPr>
       <w:r>
         <w:t xml:space="preserve">The Picotuner's IP address and its five ports (status, and command/TS pairs for tuners A and B). Requires a Lynx restart - these are read once at startup by background monitoring threads, not re-read live.</w:t>
+      </w:r>
+    </w:p>
+    <w:p>
+      <w:pPr>
+        <w:spacing w:after="150"/>
+      </w:pPr>
+      <w:r>
+        <w:t xml:space="preserve">A second card, “Discovered on this network”, sits directly below it - every Picotuner currently broadcasting on the local network, refreshed every 5 seconds, each with a “Use” button that fills the IP address field in directly. This is a genuine UDP broadcast, so it shows every unit on the network, not just the one currently configured - useful both for first-time setup and for finding a unit whose address has changed.</w:t>
       </w:r>
     </w:p>
     <w:p>

</xml_diff>

<commit_message>
GNSS Location & Bug Fixes
See Change Log
</commit_message>
<xml_diff>
--- a/docs/lynx_webui_manual.docx
+++ b/docs/lynx_webui_manual.docx
@@ -1882,23 +1882,23 @@
                 <w:sz w:val="20"/>
                 <w:szCs w:val="20"/>
               </w:rPr>
-              <w:t xml:space="preserve">Portable locator override</w:t>
-            </w:r>
-          </w:p>
-        </w:tc>
-        <w:tc>
-          <w:tcPr>
-            <w:tcW w:type="dxa" w:w="5200"/>
-          </w:tcPr>
-          <w:p>
-            <w:r>
-              <w:rPr>
-                <w:b w:val="false"/>
-                <w:bCs w:val="false"/>
-                <w:sz w:val="20"/>
-                <w:szCs w:val="20"/>
-              </w:rPr>
-              <w:t xml:space="preserve">When a contacted station is operating portable and hasn't updated their own QRZ profile, QRZ's distance/bearing calculation uses their stale, registered locator. Set this to override it with their actual, current one for every contact logged while it's set - clear it (empty + save) once the portable session ends. Also shown on the OSD, on the physical screen, whenever it's active, as a reminder it's still set.</w:t>
+              <w:t xml:space="preserve">Portable locator (this receiver’s own position)</w:t>
+            </w:r>
+          </w:p>
+        </w:tc>
+        <w:tc>
+          <w:tcPr>
+            <w:tcW w:type="dxa" w:w="5200"/>
+          </w:tcPr>
+          <w:p>
+            <w:r>
+              <w:rPr>
+                <w:b w:val="false"/>
+                <w:bCs w:val="false"/>
+                <w:sz w:val="20"/>
+                <w:szCs w:val="20"/>
+              </w:rPr>
+              <w:t xml:space="preserve">Where THIS receiver is, when it isn't at its registered station address - operating portable, from a rally, or a temporary site. Submitted as the ADIF MY_GRIDSQUARE field, so QRZ calculates distance and bearing from where you actually were rather than from your profile address. It does not describe the station you contacted; QRZ takes their position from their own profile. Leave it empty for normal operation at home and QRZ uses your registered locator as usual. With GNSS set to Automatic (Section 3.11) this field is filled from GPS and can't be typed into; in Manual, whatever you type here is what gets logged. Also shown on the OSD, on the physical screen, whenever it's set, as a reminder.</w:t>
             </w:r>
           </w:p>
         </w:tc>
@@ -3043,6 +3043,451 @@
       </w:pPr>
       <w:r>
         <w:t xml:space="preserve">Map data is pre-clipped and bundled in geo/ — nothing is fetched from the internet at runtime, so this works at a site with no outbound connectivity beyond the QRZ lookup itself. Coastlines, borders, rivers, lakes and urban areas are Natural Earth (public domain); the town list is GeoNames (CC BY), credited on the card itself.</w:t>
+      </w:r>
+    </w:p>
+    <w:p>
+      <w:pPr>
+        <w:pStyle w:val="Heading2"/>
+        <w:spacing w:after="150" w:before="300"/>
+      </w:pPr>
+      <w:r>
+        <w:t xml:space="preserve">3.11 GNSS Portable Locator</w:t>
+      </w:r>
+    </w:p>
+    <w:p>
+      <w:pPr>
+        <w:spacing w:after="150"/>
+      </w:pPr>
+      <w:r>
+        <w:t xml:space="preserve">Sets this receiver's own position automatically from a GPS receiver, for operating away from the registered station address. With an optional Waveshare L76K GNSS HAT fitted, Lynx reads the position continuously and fills in the Portable locator field on the QRZ card (Section 3.5), so logged contacts carry where you actually were. A fixed site with no HAT fitted is unaffected: nothing responds on the serial port, the card shows No GNSS Module, and the locator stays exactly as configured.</w:t>
+      </w:r>
+    </w:p>
+    <w:p>
+      <w:pPr>
+        <w:spacing w:after="150"/>
+      </w:pPr>
+      <w:r>
+        <w:t xml:space="preserve">The card offers two modes:</w:t>
+      </w:r>
+    </w:p>
+    <w:tbl>
+      <w:tblPr>
+        <w:tblW w:type="dxa" w:w="9000"/>
+        <w:tblBorders>
+          <w:top w:val="single" w:color="auto" w:sz="4"/>
+          <w:left w:val="single" w:color="auto" w:sz="4"/>
+          <w:bottom w:val="single" w:color="auto" w:sz="4"/>
+          <w:right w:val="single" w:color="auto" w:sz="4"/>
+          <w:insideH w:val="single" w:color="auto" w:sz="4"/>
+          <w:insideV w:val="single" w:color="auto" w:sz="4"/>
+        </w:tblBorders>
+      </w:tblPr>
+      <w:tblGrid>
+        <w:gridCol w:w="3000"/>
+        <w:gridCol w:w="6000"/>
+      </w:tblGrid>
+      <w:tr>
+        <w:tc>
+          <w:tcPr>
+            <w:tcW w:type="dxa" w:w="3000"/>
+            <w:shd w:fill="2C3E50" w:val="clear"/>
+          </w:tcPr>
+          <w:p>
+            <w:r>
+              <w:rPr>
+                <w:b/>
+                <w:bCs/>
+                <w:color w:val="FFFFFF"/>
+                <w:sz w:val="20"/>
+                <w:szCs w:val="20"/>
+              </w:rPr>
+              <w:t xml:space="preserve">Mode</w:t>
+            </w:r>
+          </w:p>
+        </w:tc>
+        <w:tc>
+          <w:tcPr>
+            <w:tcW w:type="dxa" w:w="6000"/>
+            <w:shd w:fill="2C3E50" w:val="clear"/>
+          </w:tcPr>
+          <w:p>
+            <w:r>
+              <w:rPr>
+                <w:b/>
+                <w:bCs/>
+                <w:color w:val="FFFFFF"/>
+                <w:sz w:val="20"/>
+                <w:szCs w:val="20"/>
+              </w:rPr>
+              <w:t xml:space="preserve">Meaning</w:t>
+            </w:r>
+          </w:p>
+        </w:tc>
+      </w:tr>
+      <w:tr>
+        <w:tc>
+          <w:tcPr>
+            <w:tcW w:type="dxa" w:w="3000"/>
+          </w:tcPr>
+          <w:p>
+            <w:r>
+              <w:rPr>
+                <w:b w:val="false"/>
+                <w:bCs w:val="false"/>
+                <w:sz w:val="20"/>
+                <w:szCs w:val="20"/>
+              </w:rPr>
+              <w:t xml:space="preserve">Automatic (default)</w:t>
+            </w:r>
+          </w:p>
+        </w:tc>
+        <w:tc>
+          <w:tcPr>
+            <w:tcW w:type="dxa" w:w="6000"/>
+          </w:tcPr>
+          <w:p>
+            <w:r>
+              <w:rPr>
+                <w:b w:val="false"/>
+                <w:bCs w:val="false"/>
+                <w:sz w:val="20"/>
+                <w:szCs w:val="20"/>
+              </w:rPr>
+              <w:t xml:space="preserve">GPS drives the locator. Once a fix has held the same 6-character square for 30 seconds, that square is written to the Portable locator field, which becomes read-only and tracks GPS from then on. The 30-second hold matters when parked near a square boundary, where a position wandering by a few metres would otherwise flip the logged square back and forth. Until a fix is confirmed - cold start, indoors, or no HAT - whatever is already in the field is left alone.</w:t>
+            </w:r>
+          </w:p>
+        </w:tc>
+      </w:tr>
+      <w:tr>
+        <w:tc>
+          <w:tcPr>
+            <w:tcW w:type="dxa" w:w="3000"/>
+          </w:tcPr>
+          <w:p>
+            <w:r>
+              <w:rPr>
+                <w:b w:val="false"/>
+                <w:bCs w:val="false"/>
+                <w:sz w:val="20"/>
+                <w:szCs w:val="20"/>
+              </w:rPr>
+              <w:t xml:space="preserve">Manual</w:t>
+            </w:r>
+          </w:p>
+        </w:tc>
+        <w:tc>
+          <w:tcPr>
+            <w:tcW w:type="dxa" w:w="6000"/>
+          </w:tcPr>
+          <w:p>
+            <w:r>
+              <w:rPr>
+                <w:b w:val="false"/>
+                <w:bCs w:val="false"/>
+                <w:sz w:val="20"/>
+                <w:szCs w:val="20"/>
+              </w:rPr>
+              <w:t xml:space="preserve">Whatever you type in the Portable locator field is what gets logged, and GPS never overwrites it, even with a HAT fitted and holding a fix. Position is still shown on this card for information. Always selectable whether or not a module is present, since it doesn't depend on one.</w:t>
+            </w:r>
+          </w:p>
+        </w:tc>
+      </w:tr>
+    </w:tbl>
+    <w:p>
+      <w:pPr>
+        <w:spacing w:after="150"/>
+      </w:pPr>
+    </w:p>
+    <w:p>
+      <w:pPr>
+        <w:pBdr>
+          <w:left w:val="single" w:color="E8A33D" w:sz="12" w:space="8"/>
+        </w:pBdr>
+        <w:shd w:fill="FFF4E5" w:val="clear"/>
+        <w:spacing w:after="200" w:before="100"/>
+        <w:ind w:left="200"/>
+      </w:pPr>
+      <w:r>
+        <w:rPr>
+          <w:i/>
+          <w:iCs/>
+          <w:sz w:val="20"/>
+          <w:szCs w:val="20"/>
+        </w:rPr>
+        <w:t xml:space="preserve">There is deliberately no Off. A site with no HAT costs nothing either way, and a site with one fitted usually still wants GPS time (below) even when the locator is set by hand - which is exactly what Manual gives you.</w:t>
+      </w:r>
+    </w:p>
+    <w:p>
+      <w:pPr>
+        <w:spacing w:after="150"/>
+      </w:pPr>
+      <w:r>
+        <w:t xml:space="preserve">A second, independent toggle on the same card sets the system clock from GPS when there's no internet. A Raspberry Pi has no battery-backed clock, so a receiver taken somewhere without a network has no reliable idea of the time, and every logged contact is timestamped wrongly. GPS carries an accurate time signal, and Lynx feeds it to the system's timekeeping service; when the internet is reachable the normal time servers are used instead, with no switching needed. It's independent of the locator mode above because the two are genuinely separate questions.</w:t>
+      </w:r>
+    </w:p>
+    <w:p>
+      <w:pPr>
+        <w:spacing w:after="150"/>
+      </w:pPr>
+      <w:r>
+        <w:t xml:space="preserve">The status box below the modes shows what the receiver is actually doing:</w:t>
+      </w:r>
+    </w:p>
+    <w:tbl>
+      <w:tblPr>
+        <w:tblW w:type="dxa" w:w="9000"/>
+        <w:tblBorders>
+          <w:top w:val="single" w:color="auto" w:sz="4"/>
+          <w:left w:val="single" w:color="auto" w:sz="4"/>
+          <w:bottom w:val="single" w:color="auto" w:sz="4"/>
+          <w:right w:val="single" w:color="auto" w:sz="4"/>
+          <w:insideH w:val="single" w:color="auto" w:sz="4"/>
+          <w:insideV w:val="single" w:color="auto" w:sz="4"/>
+        </w:tblBorders>
+      </w:tblPr>
+      <w:tblGrid>
+        <w:gridCol w:w="3000"/>
+        <w:gridCol w:w="6000"/>
+      </w:tblGrid>
+      <w:tr>
+        <w:tc>
+          <w:tcPr>
+            <w:tcW w:type="dxa" w:w="3000"/>
+            <w:shd w:fill="2C3E50" w:val="clear"/>
+          </w:tcPr>
+          <w:p>
+            <w:r>
+              <w:rPr>
+                <w:b/>
+                <w:bCs/>
+                <w:color w:val="FFFFFF"/>
+                <w:sz w:val="20"/>
+                <w:szCs w:val="20"/>
+              </w:rPr>
+              <w:t xml:space="preserve">Row</w:t>
+            </w:r>
+          </w:p>
+        </w:tc>
+        <w:tc>
+          <w:tcPr>
+            <w:tcW w:type="dxa" w:w="6000"/>
+            <w:shd w:fill="2C3E50" w:val="clear"/>
+          </w:tcPr>
+          <w:p>
+            <w:r>
+              <w:rPr>
+                <w:b/>
+                <w:bCs/>
+                <w:color w:val="FFFFFF"/>
+                <w:sz w:val="20"/>
+                <w:szCs w:val="20"/>
+              </w:rPr>
+              <w:t xml:space="preserve">Meaning</w:t>
+            </w:r>
+          </w:p>
+        </w:tc>
+      </w:tr>
+      <w:tr>
+        <w:tc>
+          <w:tcPr>
+            <w:tcW w:type="dxa" w:w="3000"/>
+          </w:tcPr>
+          <w:p>
+            <w:r>
+              <w:rPr>
+                <w:b w:val="false"/>
+                <w:bCs w:val="false"/>
+                <w:sz w:val="20"/>
+                <w:szCs w:val="20"/>
+              </w:rPr>
+              <w:t xml:space="preserve">Receiver</w:t>
+            </w:r>
+          </w:p>
+        </w:tc>
+        <w:tc>
+          <w:tcPr>
+            <w:tcW w:type="dxa" w:w="6000"/>
+          </w:tcPr>
+          <w:p>
+            <w:r>
+              <w:rPr>
+                <w:b w:val="false"/>
+                <w:bCs w:val="false"/>
+                <w:sz w:val="20"/>
+                <w:szCs w:val="20"/>
+              </w:rPr>
+              <w:t xml:space="preserve">Whether anything is responding on the serial port</w:t>
+            </w:r>
+          </w:p>
+        </w:tc>
+      </w:tr>
+      <w:tr>
+        <w:tc>
+          <w:tcPr>
+            <w:tcW w:type="dxa" w:w="3000"/>
+          </w:tcPr>
+          <w:p>
+            <w:r>
+              <w:rPr>
+                <w:b w:val="false"/>
+                <w:bCs w:val="false"/>
+                <w:sz w:val="20"/>
+                <w:szCs w:val="20"/>
+              </w:rPr>
+              <w:t xml:space="preserve">Locator (8-char)</w:t>
+            </w:r>
+          </w:p>
+        </w:tc>
+        <w:tc>
+          <w:tcPr>
+            <w:tcW w:type="dxa" w:w="6000"/>
+          </w:tcPr>
+          <w:p>
+            <w:r>
+              <w:rPr>
+                <w:b w:val="false"/>
+                <w:bCs w:val="false"/>
+                <w:sz w:val="20"/>
+                <w:szCs w:val="20"/>
+              </w:rPr>
+              <w:t xml:space="preserve">Current position to 8 characters, finer than the 6 characters logged to QRZ</w:t>
+            </w:r>
+          </w:p>
+        </w:tc>
+      </w:tr>
+      <w:tr>
+        <w:tc>
+          <w:tcPr>
+            <w:tcW w:type="dxa" w:w="3000"/>
+          </w:tcPr>
+          <w:p>
+            <w:r>
+              <w:rPr>
+                <w:b w:val="false"/>
+                <w:bCs w:val="false"/>
+                <w:sz w:val="20"/>
+                <w:szCs w:val="20"/>
+              </w:rPr>
+              <w:t xml:space="preserve">Satellites / HDOP</w:t>
+            </w:r>
+          </w:p>
+        </w:tc>
+        <w:tc>
+          <w:tcPr>
+            <w:tcW w:type="dxa" w:w="6000"/>
+          </w:tcPr>
+          <w:p>
+            <w:r>
+              <w:rPr>
+                <w:b w:val="false"/>
+                <w:bCs w:val="false"/>
+                <w:sz w:val="20"/>
+                <w:szCs w:val="20"/>
+              </w:rPr>
+              <w:t xml:space="preserve">Satellites used and dilution of precision - lower HDOP is a better fix</w:t>
+            </w:r>
+          </w:p>
+        </w:tc>
+      </w:tr>
+      <w:tr>
+        <w:tc>
+          <w:tcPr>
+            <w:tcW w:type="dxa" w:w="3000"/>
+          </w:tcPr>
+          <w:p>
+            <w:r>
+              <w:rPr>
+                <w:b w:val="false"/>
+                <w:bCs w:val="false"/>
+                <w:sz w:val="20"/>
+                <w:szCs w:val="20"/>
+              </w:rPr>
+              <w:t xml:space="preserve">Time sync</w:t>
+            </w:r>
+          </w:p>
+        </w:tc>
+        <w:tc>
+          <w:tcPr>
+            <w:tcW w:type="dxa" w:w="6000"/>
+          </w:tcPr>
+          <w:p>
+            <w:r>
+              <w:rPr>
+                <w:b w:val="false"/>
+                <w:bCs w:val="false"/>
+                <w:sz w:val="20"/>
+                <w:szCs w:val="20"/>
+              </w:rPr>
+              <w:t xml:space="preserve">Off, Active, Waiting for a fix, or Unavailable on this receiver</w:t>
+            </w:r>
+          </w:p>
+        </w:tc>
+      </w:tr>
+      <w:tr>
+        <w:tc>
+          <w:tcPr>
+            <w:tcW w:type="dxa" w:w="3000"/>
+          </w:tcPr>
+          <w:p>
+            <w:r>
+              <w:rPr>
+                <w:b w:val="false"/>
+                <w:bCs w:val="false"/>
+                <w:sz w:val="20"/>
+                <w:szCs w:val="20"/>
+              </w:rPr>
+              <w:t xml:space="preserve">Status</w:t>
+            </w:r>
+          </w:p>
+        </w:tc>
+        <w:tc>
+          <w:tcPr>
+            <w:tcW w:type="dxa" w:w="6000"/>
+          </w:tcPr>
+          <w:p>
+            <w:r>
+              <w:rPr>
+                <w:b w:val="false"/>
+                <w:bCs w:val="false"/>
+                <w:sz w:val="20"/>
+                <w:szCs w:val="20"/>
+              </w:rPr>
+              <w:t xml:space="preserve">Confirmed fix, settling with seconds remaining, waiting, or No GNSS Module</w:t>
+            </w:r>
+          </w:p>
+        </w:tc>
+      </w:tr>
+    </w:tbl>
+    <w:p>
+      <w:pPr>
+        <w:spacing w:after="150"/>
+      </w:pPr>
+    </w:p>
+    <w:p>
+      <w:pPr>
+        <w:spacing w:after="150"/>
+      </w:pPr>
+      <w:r>
+        <w:t xml:space="preserve">The header of the main receiver page also shows the locator alongside the other status badges, in green with (GPS) when it comes from a confirmed fix and grey with (config) when it's the configured value, so it's never ambiguous which one a contact will be logged with.</w:t>
+      </w:r>
+    </w:p>
+    <w:p>
+      <w:pPr>
+        <w:pBdr>
+          <w:left w:val="single" w:color="E8A33D" w:sz="12" w:space="8"/>
+        </w:pBdr>
+        <w:shd w:fill="FFF4E5" w:val="clear"/>
+        <w:spacing w:after="200" w:before="100"/>
+        <w:ind w:left="200"/>
+      </w:pPr>
+      <w:r>
+        <w:rPr>
+          <w:i/>
+          <w:iCs/>
+          <w:sz w:val="20"/>
+          <w:szCs w:val="20"/>
+        </w:rPr>
+        <w:t xml:space="preserve">GPS time sync needs a supporting service installed on the receiver. Where that hasn't been done, the toggle shows Unavailable on this receiver and the clock continues to use the internet as normal. Position and locator work regardless.</w:t>
       </w:r>
     </w:p>
     <w:p>

</xml_diff>